<commit_message>
VII theme memo v23: strip company names from Materials Discovery Labs tailwinds, headwinds and focus (generic cites); names kept only on example line and Orbital lead-example sentence
</commit_message>
<xml_diff>
--- a/themes/ai-native-industrial-production/insights/exports/VII-theme-memo-v23-2026-10-29.docx
+++ b/themes/ai-native-industrial-production/insights/exports/VII-theme-memo-v23-2026-10-29.docx
@@ -1466,7 +1466,7 @@
       </w:r>
       <w:r>
         <w:rPr/>
-        <w:t xml:space="preserve">A new material has typically taken 10 to 20 years and more than $100M to develop (claim), and the leading labs report making more than a thousand alloys in about six months (claim). Simulation is getting cheaper as well, and a Sandia machine-learning framework runs electronic-structure calculations more than 5,000 times faster than the standard method on 2,000-atom systems (DOE). Meta has also released an open dataset of about 110 million materials calculations that any lab can use to train its models (Meta).</w:t>
+        <w:t xml:space="preserve">A new material has typically taken 10 to 20 years and more than $100M to develop (claim), and the leading labs report making more than a thousand alloys in about six months (claim). Simulation is getting cheaper as well, and a national-lab machine-learning framework runs electronic-structure calculations more than 5,000 times faster than the standard method on 2,000-atom systems (DOE). Open datasets of more than 100 million materials calculations are now free for any lab to train its models on (industry research).</w:t>
       </w:r>
     </w:p>
     <w:p>
@@ -1486,7 +1486,7 @@
       </w:r>
       <w:r>
         <w:rPr/>
-        <w:t xml:space="preserve">Data centers are on track to use about 945 TWh of power by 2030, up from 415 TWh in 2024, and cooling takes 7% to over 30% of a site's power (IEA). Chipmakers need new ways to carry heat away from denser chips, and one lab says it already works with a semiconductor maker on heat dissipation (claim, Periodic Labs).</w:t>
+        <w:t xml:space="preserve">Data centers are on track to use about 945 TWh of power by 2030, up from 415 TWh in 2024, and cooling takes 7% to over 30% of a site's power (IEA). Chipmakers need new ways to carry heat away from denser chips, and AI materials labs already report paid work for semiconductor makers on heat dissipation (claim).</w:t>
       </w:r>
     </w:p>
     <w:p>
@@ -1546,7 +1546,7 @@
       </w:r>
       <w:r>
         <w:rPr/>
-        <w:t xml:space="preserve">Periodic Labs raised a $300M seed round with NVIDIA among its backers (Periodic Labs), Lila Sciences raised $550M across its seed and Series A rounds (Lila), and RTX Ventures, the venture arm of the defense contractor RTX, led a $55M round in Radical AI (Radical AI).</w:t>
+        <w:t xml:space="preserve">Leading AI materials labs raised seed and early rounds of $55M to $550M in 2025, with chipmakers and a defense prime among the backers (company announcements).</w:t>
       </w:r>
     </w:p>
     <w:p>
@@ -1606,7 +1606,7 @@
       </w:r>
       <w:r>
         <w:rPr/>
-        <w:t xml:space="preserve">Two UC Santa Barbara chemists who reviewed DeepMind's 2.2 million predicted crystals found scant evidence of compounds that were novel, credible and useful at once (Chemistry of Materials). A Princeton and UCL review argued that none of the materials first reported by Berkeley's autonomous A-Lab were new (PRX Energy), and the paper was later corrected from 41 compounds out of 58 targets to 36 out of 57 (Nature).</w:t>
+        <w:t xml:space="preserve">Academic chemists who reviewed one widely cited set of 2.2 million AI-predicted crystals found scant evidence of compounds that were novel, credible and useful at once (peer-reviewed critique). A second review argued that none of the materials first reported by a leading autonomous lab were new, and the original paper was later corrected from 41 compounds out of 58 targets to 36 out of 57 (peer-reviewed critique, journal correction).</w:t>
       </w:r>
     </w:p>
     <w:p>
@@ -1626,7 +1626,7 @@
       </w:r>
       <w:r>
         <w:rPr/>
-        <w:t xml:space="preserve">Google DeepMind published its predicted crystals openly, and Microsoft released MatterGen, a generative model whose design for a new compound was made in the lab and came within 20% of its target stiffness (Microsoft Research).</w:t>
+        <w:t xml:space="preserve">Big technology companies have published millions of predicted crystals and released open generative design models, and one such model designed a compound that was made in the lab and came within 20% of its target stiffness (industry research).</w:t>
       </w:r>
     </w:p>
     <w:p>
@@ -1646,7 +1646,7 @@
       </w:r>
       <w:r>
         <w:rPr/>
-        <w:t xml:space="preserve">The best-funded labs have raised $300M to $550M each while revenue stays small (Periodic Labs, Lila), and a lab that builds its own plant to keep more of the margin takes on plant costs of hundreds of millions of dollars, which left Umicore's battery-materials unit losing money on €436M of revenue (company filings).</w:t>
+        <w:t xml:space="preserve">The best-funded labs have raised $300M to $550M each while revenue stays small (company announcements), and a lab that builds its own plant to keep more of the margin takes on plant costs of hundreds of millions of dollars, where even a leading European cathode maker's battery-materials unit lost money on €436M of revenue (company filings).</w:t>
       </w:r>
     </w:p>
     <w:p>

</xml_diff>